<commit_message>
Add operating-cost reduction option + ranked KPI recommendation for Diamante
</commit_message>
<xml_diff>
--- a/IAC-RI-EVA-FCF-Incentive-Summary.docx
+++ b/IAC-RI-EVA-FCF-Incentive-Summary.docx
@@ -9,7 +9,7 @@
           <w:color w:val="1F3D6B"/>
           <w:sz w:val="28"/>
         </w:rPr>
-        <w:t>Residual Income, Economic Value Added &amp; Free Cash Flow — Summary for Evaluating Incentive Schemes</w:t>
+        <w:t>Alternative Performance Measures for an Incentive Scheme — RI, EVA, Free Cash Flow &amp; Operating-Cost Reduction</w:t>
       </w:r>
     </w:p>
     <w:p>
@@ -21,7 +21,7 @@
           <w:i/>
           <w:sz w:val="18"/>
         </w:rPr>
-        <w:t>Based on the IAC MAF performance-evaluation notes (residual income and economic value added) and the free cash flow method. These three measures are the value- and cash-based alternatives you would use to redesign or evaluate an incentive scheme (for example Diamante’s), because they reward real value creation rather than accounting profit or a percentage return. Amounts are illustrative unless stated.</w:t>
+        <w:t>Based on the IAC MAF performance-evaluation notes (residual income and economic value added) and the free cash flow method, with the reduction in operating cost added as a fourth option. These are the value- and cash-based measures used to redesign or evaluate an incentive scheme such as Diamante’s, because they reward real value and cash rather than accounting profit or a percentage return. The document ends with a ranked recommendation for Diamante. Amounts are illustrative unless stated.</w:t>
       </w:r>
     </w:p>
     <w:p>
@@ -108,7 +108,7 @@
         <w:rPr>
           <w:sz w:val="20"/>
         </w:rPr>
-        <w:t>It is used so that the measure reflects operating performance and not the financing mix.</w:t>
+        <w:t>It is used so the measure reflects operating performance and not the financing mix.</w:t>
       </w:r>
     </w:p>
     <w:p>
@@ -203,18 +203,6 @@
         <w:rPr>
           <w:sz w:val="20"/>
         </w:rPr>
-        <w:t>Whether an item such as an overdraft is permanent depends on the nature of the business.</w:t>
-      </w:r>
-    </w:p>
-    <w:p>
-      <w:pPr>
-        <w:pStyle w:val="ListBullet"/>
-        <w:spacing w:after="60"/>
-      </w:pPr>
-      <w:r>
-        <w:rPr>
-          <w:sz w:val="20"/>
-        </w:rPr>
         <w:t>When evaluating an individual manager, allocated costs such as head-office costs are excluded, because they are not controllable.</w:t>
       </w:r>
     </w:p>
@@ -290,55 +278,6 @@
           <w:color w:val="1F3D6B"/>
           <w:sz w:val="22"/>
         </w:rPr>
-        <w:t>Inputs</w:t>
-      </w:r>
-    </w:p>
-    <w:p>
-      <w:pPr>
-        <w:pStyle w:val="ListBullet"/>
-        <w:spacing w:after="60"/>
-      </w:pPr>
-      <w:r>
-        <w:rPr>
-          <w:sz w:val="20"/>
-        </w:rPr>
-        <w:t>NOPAT, calculated as above.</w:t>
-      </w:r>
-    </w:p>
-    <w:p>
-      <w:pPr>
-        <w:pStyle w:val="ListBullet"/>
-        <w:spacing w:after="60"/>
-      </w:pPr>
-      <w:r>
-        <w:rPr>
-          <w:sz w:val="20"/>
-        </w:rPr>
-        <w:t>The weighted average cost of capital (WACC), which can be risk-adjusted per division.</w:t>
-      </w:r>
-    </w:p>
-    <w:p>
-      <w:pPr>
-        <w:pStyle w:val="ListBullet"/>
-        <w:spacing w:after="60"/>
-      </w:pPr>
-      <w:r>
-        <w:rPr>
-          <w:sz w:val="20"/>
-        </w:rPr>
-        <w:t>Net investment (permanent capital), as above.</w:t>
-      </w:r>
-    </w:p>
-    <w:p>
-      <w:pPr>
-        <w:spacing w:before="100" w:after="20"/>
-      </w:pPr>
-      <w:r>
-        <w:rPr>
-          <w:b/>
-          <w:color w:val="1F3D6B"/>
-          <w:sz w:val="22"/>
-        </w:rPr>
         <w:t>Easy example</w:t>
       </w:r>
     </w:p>
@@ -375,7 +314,7 @@
         <w:rPr>
           <w:sz w:val="20"/>
         </w:rPr>
-        <w:t>Residual income is R100 − R50 = R50, which means the division created R50 of value above the cost of its capital.</w:t>
+        <w:t>Residual income is R100 − R50 = R50, meaning the division created R50 of value above the cost of its capital.</w:t>
       </w:r>
     </w:p>
     <w:p>
@@ -388,7 +327,7 @@
           <w:color w:val="1F3D6B"/>
           <w:sz w:val="22"/>
         </w:rPr>
-        <w:t>Why it is good for an incentive scheme</w:t>
+        <w:t>Why it suits an incentive scheme, and its limits</w:t>
       </w:r>
     </w:p>
     <w:p>
@@ -400,7 +339,7 @@
         <w:rPr>
           <w:sz w:val="20"/>
         </w:rPr>
-        <w:t>It rewards any project or action that earns more than the cost of capital, so it encourages value-adding growth.</w:t>
+        <w:t>It rewards any action that earns more than the cost of capital, so it encourages value-adding growth.</w:t>
       </w:r>
     </w:p>
     <w:p>
@@ -412,32 +351,7 @@
         <w:rPr>
           <w:sz w:val="20"/>
         </w:rPr>
-        <w:t>It fixes the main flaw of return on investment, which can make a manager reject a good project because it lowers a high percentage return.</w:t>
-      </w:r>
-    </w:p>
-    <w:p>
-      <w:pPr>
-        <w:pStyle w:val="ListBullet"/>
-        <w:spacing w:after="60"/>
-      </w:pPr>
-      <w:r>
-        <w:rPr>
-          <w:sz w:val="20"/>
-        </w:rPr>
-        <w:t>A negative residual income clearly shows value is being destroyed, so a bonus is not warranted.</w:t>
-      </w:r>
-    </w:p>
-    <w:p>
-      <w:pPr>
-        <w:spacing w:before="100" w:after="20"/>
-      </w:pPr>
-      <w:r>
-        <w:rPr>
-          <w:b/>
-          <w:color w:val="1F3D6B"/>
-          <w:sz w:val="22"/>
-        </w:rPr>
-        <w:t>Limitations</w:t>
+        <w:t>It fixes the main flaw of return on investment, which can make a manager reject a good project that lowers a high percentage return.</w:t>
       </w:r>
     </w:p>
     <w:p>
@@ -450,18 +364,6 @@
           <w:sz w:val="20"/>
         </w:rPr>
         <w:t>It is an absolute rand figure, so it is harder to compare divisions of very different size.</w:t>
-      </w:r>
-    </w:p>
-    <w:p>
-      <w:pPr>
-        <w:pStyle w:val="ListBullet"/>
-        <w:spacing w:after="60"/>
-      </w:pPr>
-      <w:r>
-        <w:rPr>
-          <w:sz w:val="20"/>
-        </w:rPr>
-        <w:t>It still relies on accounting profit, which can be distorted by non-cash items.</w:t>
       </w:r>
     </w:p>
     <w:p>
@@ -536,7 +438,7 @@
         <w:rPr>
           <w:sz w:val="20"/>
         </w:rPr>
-        <w:t>Expenditure with an enduring benefit, such as a major marketing or research campaign, is capitalised and written off over the period the benefit lasts, rather than expensed at once.</w:t>
+        <w:t>Expenditure with an enduring benefit, such as a major marketing or research campaign, is capitalised and written off over the period the benefit lasts.</w:t>
       </w:r>
     </w:p>
     <w:p>
@@ -548,7 +450,7 @@
         <w:rPr>
           <w:sz w:val="20"/>
         </w:rPr>
-        <w:t>Operating-type leases are capitalised, with the asset added to net investment and the lease expense replaced by depreciation, discounted at the pre-tax cost of debt.</w:t>
+        <w:t>Operating-type leases are capitalised, discounted at the pre-tax cost of debt, with the lease expense replaced by depreciation.</w:t>
       </w:r>
     </w:p>
     <w:p>
@@ -560,7 +462,7 @@
         <w:rPr>
           <w:sz w:val="20"/>
         </w:rPr>
-        <w:t>Non-cash provisions and similar accounting items are often added back so the measure reflects economic rather than accounting reality.</w:t>
+        <w:t>Non-cash provisions and similar items are often added back so the measure reflects economic rather than accounting reality.</w:t>
       </w:r>
     </w:p>
     <w:p>
@@ -585,7 +487,7 @@
           <w:color w:val="1F3D6B"/>
           <w:sz w:val="22"/>
         </w:rPr>
-        <w:t>Easy example</w:t>
+        <w:t>Easy example, and why it suits an incentive scheme</w:t>
       </w:r>
     </w:p>
     <w:p>
@@ -597,44 +499,7 @@
         <w:rPr>
           <w:sz w:val="20"/>
         </w:rPr>
-        <w:t>Start with the residual income example of R50.</w:t>
-      </w:r>
-    </w:p>
-    <w:p>
-      <w:pPr>
-        <w:pStyle w:val="ListBullet"/>
-        <w:spacing w:after="60"/>
-      </w:pPr>
-      <w:r>
-        <w:rPr>
-          <w:sz w:val="20"/>
-        </w:rPr>
-        <w:t>If the division also spent R40 on a brand campaign with a lasting benefit, EVA adds that R40 back into capital and writes it off over its useful life.</w:t>
-      </w:r>
-    </w:p>
-    <w:p>
-      <w:pPr>
-        <w:pStyle w:val="ListBullet"/>
-        <w:spacing w:after="60"/>
-      </w:pPr>
-      <w:r>
-        <w:rPr>
-          <w:sz w:val="20"/>
-        </w:rPr>
-        <w:t>This gives a truer picture of the value created, because the spending builds an asset rather than being a one-off cost.</w:t>
-      </w:r>
-    </w:p>
-    <w:p>
-      <w:pPr>
-        <w:spacing w:before="100" w:after="20"/>
-      </w:pPr>
-      <w:r>
-        <w:rPr>
-          <w:b/>
-          <w:color w:val="1F3D6B"/>
-          <w:sz w:val="22"/>
-        </w:rPr>
-        <w:t>Why it is good for an incentive scheme</w:t>
+        <w:t>Starting from the residual income of R50, if the division also spent R40 on a lasting brand campaign, EVA adds that R40 back into capital and writes it off over its useful life.</w:t>
       </w:r>
     </w:p>
     <w:p>
@@ -658,7 +523,7 @@
         <w:rPr>
           <w:sz w:val="20"/>
         </w:rPr>
-        <w:t>The adjustments discourage short-term decisions, such as cutting marketing or research to boost this year’s profit.</w:t>
+        <w:t>A bonus bank can be attached, where part of the EVA bonus is retained and forfeited in years when EVA is negative.</w:t>
       </w:r>
     </w:p>
     <w:p>
@@ -670,44 +535,7 @@
         <w:rPr>
           <w:sz w:val="20"/>
         </w:rPr>
-        <w:t>A bonus bank can be attached, where part of the EVA bonus is retained and forfeited in years when EVA is negative.</w:t>
-      </w:r>
-    </w:p>
-    <w:p>
-      <w:pPr>
-        <w:spacing w:before="100" w:after="20"/>
-      </w:pPr>
-      <w:r>
-        <w:rPr>
-          <w:b/>
-          <w:color w:val="1F3D6B"/>
-          <w:sz w:val="22"/>
-        </w:rPr>
-        <w:t>Limitations</w:t>
-      </w:r>
-    </w:p>
-    <w:p>
-      <w:pPr>
-        <w:pStyle w:val="ListBullet"/>
-        <w:spacing w:after="60"/>
-      </w:pPr>
-      <w:r>
-        <w:rPr>
-          <w:sz w:val="20"/>
-        </w:rPr>
-        <w:t>The adjustments require judgement and can be complex.</w:t>
-      </w:r>
-    </w:p>
-    <w:p>
-      <w:pPr>
-        <w:pStyle w:val="ListBullet"/>
-        <w:spacing w:after="60"/>
-      </w:pPr>
-      <w:r>
-        <w:rPr>
-          <w:sz w:val="20"/>
-        </w:rPr>
-        <w:t>It is sensitive to the WACC used, so the rate must be set carefully.</w:t>
+        <w:t>Its weakness is that the adjustments require judgement and it is sensitive to the WACC used.</w:t>
       </w:r>
     </w:p>
     <w:p>
@@ -724,19 +552,6 @@
           <w:sz w:val="26"/>
         </w:rPr>
         <w:t>4. Free Cash Flow (FCF)</w:t>
-      </w:r>
-    </w:p>
-    <w:p>
-      <w:pPr>
-        <w:spacing w:before="100" w:after="20"/>
-      </w:pPr>
-      <w:r>
-        <w:rPr>
-          <w:b/>
-          <w:color w:val="1F3D6B"/>
-          <w:sz w:val="22"/>
-        </w:rPr>
-        <w:t>The formulas</w:t>
       </w:r>
     </w:p>
     <w:tbl>
@@ -767,7 +582,7 @@
               <w:rPr>
                 <w:sz w:val="20"/>
               </w:rPr>
-              <w:t>Free cash flow to the firm (FCFF) = operating profit × (1 − tax) + depreciation &amp; amortisation − capital expenditure − increase in working capital</w:t>
+              <w:t>FCFF = operating profit × (1 − tax) + depreciation &amp; amortisation − capital expenditure − increase in working capital</w:t>
             </w:r>
           </w:p>
         </w:tc>
@@ -801,7 +616,7 @@
               <w:rPr>
                 <w:sz w:val="20"/>
               </w:rPr>
-              <w:t>Free cash flow to equity (FCFE) = FCFF − after-tax interest paid + net new borrowing</w:t>
+              <w:t>FCFE = FCFF − after-tax interest paid + net new borrowing</w:t>
             </w:r>
           </w:p>
         </w:tc>
@@ -816,7 +631,7 @@
         <w:rPr>
           <w:sz w:val="20"/>
         </w:rPr>
-        <w:t>For a simple performance measure, free cash flow is often taken as cash generated from operations less sustaining capital expenditure.</w:t>
+        <w:t>For a simple performance measure, free cash flow is often taken as cash from operations less sustaining capital expenditure.</w:t>
       </w:r>
     </w:p>
     <w:p>
@@ -828,7 +643,7 @@
         <w:rPr>
           <w:sz w:val="20"/>
         </w:rPr>
-        <w:t>FCFF is discounted at the WACC and gives enterprise value; less net debt gives the equity value.</w:t>
+        <w:t>FCFF is discounted at the WACC and gives enterprise value; less net debt gives equity value.</w:t>
       </w:r>
     </w:p>
     <w:p>
@@ -840,7 +655,7 @@
         <w:rPr>
           <w:sz w:val="20"/>
         </w:rPr>
-        <w:t>FCFE is discounted at the cost of equity and gives the equity value directly.</w:t>
+        <w:t>FCFE is discounted at the cost of equity and gives equity value directly.</w:t>
       </w:r>
     </w:p>
     <w:p>
@@ -853,7 +668,7 @@
           <w:color w:val="1F3D6B"/>
           <w:sz w:val="22"/>
         </w:rPr>
-        <w:t>Inputs</w:t>
+        <w:t>Easy example, and why it suits an incentive scheme</w:t>
       </w:r>
     </w:p>
     <w:p>
@@ -865,105 +680,7 @@
         <w:rPr>
           <w:sz w:val="20"/>
         </w:rPr>
-        <w:t>Operating profit and the tax rate.</w:t>
-      </w:r>
-    </w:p>
-    <w:p>
-      <w:pPr>
-        <w:pStyle w:val="ListBullet"/>
-        <w:spacing w:after="60"/>
-      </w:pPr>
-      <w:r>
-        <w:rPr>
-          <w:sz w:val="20"/>
-        </w:rPr>
-        <w:t>Depreciation and amortisation (added back, because they are non-cash).</w:t>
-      </w:r>
-    </w:p>
-    <w:p>
-      <w:pPr>
-        <w:pStyle w:val="ListBullet"/>
-        <w:spacing w:after="60"/>
-      </w:pPr>
-      <w:r>
-        <w:rPr>
-          <w:sz w:val="20"/>
-        </w:rPr>
-        <w:t>Capital expenditure and the movement in working capital.</w:t>
-      </w:r>
-    </w:p>
-    <w:p>
-      <w:pPr>
-        <w:pStyle w:val="ListBullet"/>
-        <w:spacing w:after="60"/>
-      </w:pPr>
-      <w:r>
-        <w:rPr>
-          <w:sz w:val="20"/>
-        </w:rPr>
-        <w:t>For FCFE, after-tax interest and net borrowing.</w:t>
-      </w:r>
-    </w:p>
-    <w:p>
-      <w:pPr>
-        <w:spacing w:before="100" w:after="20"/>
-      </w:pPr>
-      <w:r>
-        <w:rPr>
-          <w:b/>
-          <w:color w:val="1F3D6B"/>
-          <w:sz w:val="22"/>
-        </w:rPr>
-        <w:t>Easy example</w:t>
-      </w:r>
-    </w:p>
-    <w:p>
-      <w:pPr>
-        <w:pStyle w:val="ListBullet"/>
-        <w:spacing w:after="60"/>
-      </w:pPr>
-      <w:r>
-        <w:rPr>
-          <w:sz w:val="20"/>
-        </w:rPr>
-        <w:t>A company makes R100 of operating cash flow and spends R30 on sustaining capital expenditure.</w:t>
-      </w:r>
-    </w:p>
-    <w:p>
-      <w:pPr>
-        <w:pStyle w:val="ListBullet"/>
-        <w:spacing w:after="60"/>
-      </w:pPr>
-      <w:r>
-        <w:rPr>
-          <w:sz w:val="20"/>
-        </w:rPr>
-        <w:t>Its free cash flow is R100 − R30 = R70, which is the real spare cash the business generated.</w:t>
-      </w:r>
-    </w:p>
-    <w:p>
-      <w:pPr>
-        <w:pStyle w:val="ListBullet"/>
-        <w:spacing w:after="60"/>
-      </w:pPr>
-      <w:r>
-        <w:rPr>
-          <w:sz w:val="20"/>
-        </w:rPr>
-        <w:t>That cash can be used to pay down debt, reinvest, or pay dividends.</w:t>
-      </w:r>
-    </w:p>
-    <w:p>
-      <w:pPr>
-        <w:spacing w:before="100" w:after="20"/>
-      </w:pPr>
-      <w:r>
-        <w:rPr>
-          <w:b/>
-          <w:color w:val="1F3D6B"/>
-          <w:sz w:val="22"/>
-        </w:rPr>
-        <w:t>Why it is good for an incentive scheme</w:t>
+        <w:t>A company makes R100 of operating cash flow and spends R30 on sustaining capital expenditure, so free cash flow is R70.</w:t>
       </w:r>
     </w:p>
     <w:p>
@@ -999,7 +716,7 @@
         <w:rPr>
           <w:sz w:val="20"/>
         </w:rPr>
-        <w:t>It is the most important measure when survival and refinancing are the priority, as they are for Diamante.</w:t>
+        <w:t>It is the most important measure when survival and refinancing are the priority.</w:t>
       </w:r>
     </w:p>
     <w:p>
@@ -1015,7 +732,228 @@
           <w:color w:val="1F3D6B"/>
           <w:sz w:val="26"/>
         </w:rPr>
-        <w:t>5. Comparison — which to use in an incentive scheme</w:t>
+        <w:t>5. Reduction in operating cost (and the operating loss)</w:t>
+      </w:r>
+    </w:p>
+    <w:tbl>
+      <w:tblPr>
+        <w:tblStyle w:val="TableGrid"/>
+        <w:tblW w:type="auto" w:w="0"/>
+        <w:tblLook w:firstColumn="1" w:firstRow="1" w:lastColumn="0" w:lastRow="0" w:noHBand="0" w:noVBand="1" w:val="04A0"/>
+      </w:tblPr>
+      <w:tblGrid>
+        <w:gridCol w:w="10512"/>
+      </w:tblGrid>
+      <w:tr>
+        <w:tc>
+          <w:tcPr>
+            <w:tcW w:type="dxa" w:w="10512"/>
+            <w:shd w:val="clear" w:fill="eef2f8"/>
+          </w:tcPr>
+          <w:p>
+            <w:r/>
+            <w:r>
+              <w:rPr>
+                <w:b/>
+                <w:sz w:val="20"/>
+              </w:rPr>
+              <w:t xml:space="preserve">Formula:  </w:t>
+            </w:r>
+            <w:r>
+              <w:rPr>
+                <w:sz w:val="20"/>
+              </w:rPr>
+              <w:t>Cost reduction = prior operating cost − current operating cost  (better stated as cost per carat vs budget);  Operating-loss reduction = prior operating loss − current operating loss</w:t>
+            </w:r>
+          </w:p>
+        </w:tc>
+      </w:tr>
+    </w:tbl>
+    <w:p>
+      <w:pPr>
+        <w:spacing w:before="100" w:after="20"/>
+      </w:pPr>
+      <w:r>
+        <w:rPr>
+          <w:b/>
+          <w:color w:val="1F3D6B"/>
+          <w:sz w:val="22"/>
+        </w:rPr>
+        <w:t>Inputs</w:t>
+      </w:r>
+    </w:p>
+    <w:p>
+      <w:pPr>
+        <w:pStyle w:val="ListBullet"/>
+        <w:spacing w:after="60"/>
+      </w:pPr>
+      <w:r>
+        <w:rPr>
+          <w:sz w:val="20"/>
+        </w:rPr>
+        <w:t>Operating costs (or the operating loss) for the current and the prior period.</w:t>
+      </w:r>
+    </w:p>
+    <w:p>
+      <w:pPr>
+        <w:pStyle w:val="ListBullet"/>
+        <w:spacing w:after="60"/>
+      </w:pPr>
+      <w:r>
+        <w:rPr>
+          <w:sz w:val="20"/>
+        </w:rPr>
+        <w:t>Carats recovered, if the measure is expressed as cost per carat.</w:t>
+      </w:r>
+    </w:p>
+    <w:p>
+      <w:pPr>
+        <w:pStyle w:val="ListBullet"/>
+        <w:spacing w:after="60"/>
+      </w:pPr>
+      <w:r>
+        <w:rPr>
+          <w:sz w:val="20"/>
+        </w:rPr>
+        <w:t>The budget, if the measure is a controllable cost variance against budget.</w:t>
+      </w:r>
+    </w:p>
+    <w:p>
+      <w:pPr>
+        <w:spacing w:before="100" w:after="20"/>
+      </w:pPr>
+      <w:r>
+        <w:rPr>
+          <w:b/>
+          <w:color w:val="1F3D6B"/>
+          <w:sz w:val="22"/>
+        </w:rPr>
+        <w:t>Easy example</w:t>
+      </w:r>
+    </w:p>
+    <w:p>
+      <w:pPr>
+        <w:pStyle w:val="ListBullet"/>
+        <w:spacing w:after="60"/>
+      </w:pPr>
+      <w:r>
+        <w:rPr>
+          <w:sz w:val="20"/>
+        </w:rPr>
+        <w:t>If operating costs were R120 last year and R100 this year, the reduction is R20, or about 17%.</w:t>
+      </w:r>
+    </w:p>
+    <w:p>
+      <w:pPr>
+        <w:pStyle w:val="ListBullet"/>
+        <w:spacing w:after="60"/>
+      </w:pPr>
+      <w:r>
+        <w:rPr>
+          <w:sz w:val="20"/>
+        </w:rPr>
+        <w:t>If the operating loss was R80 last year and R50 this year, that is a R30 improvement toward break-even.</w:t>
+      </w:r>
+    </w:p>
+    <w:p>
+      <w:pPr>
+        <w:spacing w:before="100" w:after="20"/>
+      </w:pPr>
+      <w:r>
+        <w:rPr>
+          <w:b/>
+          <w:color w:val="1F3D6B"/>
+          <w:sz w:val="22"/>
+        </w:rPr>
+        <w:t>Why it suits an incentive scheme, and the key caution</w:t>
+      </w:r>
+    </w:p>
+    <w:p>
+      <w:pPr>
+        <w:pStyle w:val="ListBullet"/>
+        <w:spacing w:after="60"/>
+      </w:pPr>
+      <w:r>
+        <w:rPr>
+          <w:sz w:val="20"/>
+        </w:rPr>
+        <w:t>It is highly controllable, because operating costs are within management’s influence.</w:t>
+      </w:r>
+    </w:p>
+    <w:p>
+      <w:pPr>
+        <w:pStyle w:val="ListBullet"/>
+        <w:spacing w:after="60"/>
+      </w:pPr>
+      <w:r>
+        <w:rPr>
+          <w:sz w:val="20"/>
+        </w:rPr>
+        <w:t>It is achievable and motivating for a loss-making company, unlike an impossible profit-growth target.</w:t>
+      </w:r>
+    </w:p>
+    <w:p>
+      <w:pPr>
+        <w:pStyle w:val="ListBullet"/>
+        <w:spacing w:after="60"/>
+      </w:pPr>
+      <w:r>
+        <w:rPr>
+          <w:sz w:val="20"/>
+        </w:rPr>
+        <w:t>It directly attacks Diamante’s core problem, that mining costs now exceed revenue.</w:t>
+      </w:r>
+    </w:p>
+    <w:p>
+      <w:pPr>
+        <w:pStyle w:val="ListBullet"/>
+        <w:spacing w:after="60"/>
+      </w:pPr>
+      <w:r>
+        <w:rPr>
+          <w:sz w:val="20"/>
+        </w:rPr>
+        <w:t>The key caution is that a blunt total-cost target can be met by mining less or by cutting safety, development and rehabilitation spending.</w:t>
+      </w:r>
+    </w:p>
+    <w:p>
+      <w:pPr>
+        <w:pStyle w:val="ListBullet"/>
+        <w:spacing w:after="60"/>
+      </w:pPr>
+      <w:r>
+        <w:rPr>
+          <w:sz w:val="20"/>
+        </w:rPr>
+        <w:t>It should therefore be measured as cost per carat, or as a controllable cost variance against budget, with a volume and safety guardrail.</w:t>
+      </w:r>
+    </w:p>
+    <w:p>
+      <w:pPr>
+        <w:pStyle w:val="ListBullet"/>
+        <w:spacing w:after="60"/>
+      </w:pPr>
+      <w:r>
+        <w:rPr>
+          <w:sz w:val="20"/>
+        </w:rPr>
+        <w:t>The operating-loss version is more complete, because it also captures revenue, so management cannot win simply by shrinking the business.</w:t>
+      </w:r>
+    </w:p>
+    <w:p>
+      <w:pPr>
+        <w:spacing w:before="200" w:after="40"/>
+        <w:pBdr>
+          <w:bottom w:val="single" w:sz="6" w:space="2" w:color="808080"/>
+        </w:pBdr>
+      </w:pPr>
+      <w:r>
+        <w:rPr>
+          <w:b/>
+          <w:color w:val="1F3D6B"/>
+          <w:sz w:val="26"/>
+        </w:rPr>
+        <w:t>6. Comparison of the four options</w:t>
       </w:r>
     </w:p>
     <w:tbl>
@@ -1035,7 +973,7 @@
       <w:tr>
         <w:tc>
           <w:tcPr>
-            <w:tcW w:type="dxa" w:w="1872"/>
+            <w:tcW w:type="dxa" w:w="2160"/>
             <w:shd w:val="clear" w:fill="1f3d6b"/>
           </w:tcPr>
           <w:p>
@@ -1052,7 +990,7 @@
         </w:tc>
         <w:tc>
           <w:tcPr>
-            <w:tcW w:type="dxa" w:w="2736"/>
+            <w:tcW w:type="dxa" w:w="2448"/>
             <w:shd w:val="clear" w:fill="1f3d6b"/>
           </w:tcPr>
           <w:p>
@@ -1086,7 +1024,7 @@
         </w:tc>
         <w:tc>
           <w:tcPr>
-            <w:tcW w:type="dxa" w:w="2304"/>
+            <w:tcW w:type="dxa" w:w="2160"/>
             <w:shd w:val="clear" w:fill="1f3d6b"/>
           </w:tcPr>
           <w:p>
@@ -1122,7 +1060,151 @@
       <w:tr>
         <w:tc>
           <w:tcPr>
-            <w:tcW w:type="dxa" w:w="1872"/>
+            <w:tcW w:type="dxa" w:w="2160"/>
+          </w:tcPr>
+          <w:p>
+            <w:r/>
+            <w:r>
+              <w:rPr>
+                <w:sz w:val="17"/>
+              </w:rPr>
+              <w:t>Free cash flow</w:t>
+            </w:r>
+          </w:p>
+        </w:tc>
+        <w:tc>
+          <w:tcPr>
+            <w:tcW w:type="dxa" w:w="2448"/>
+          </w:tcPr>
+          <w:p>
+            <w:r/>
+            <w:r>
+              <w:rPr>
+                <w:sz w:val="17"/>
+              </w:rPr>
+              <w:t>Actual cash generated</w:t>
+            </w:r>
+          </w:p>
+        </w:tc>
+        <w:tc>
+          <w:tcPr>
+            <w:tcW w:type="dxa" w:w="2304"/>
+          </w:tcPr>
+          <w:p>
+            <w:r/>
+            <w:r>
+              <w:rPr>
+                <w:sz w:val="17"/>
+              </w:rPr>
+              <w:t>Hard to manipulate; tracks survival</w:t>
+            </w:r>
+          </w:p>
+        </w:tc>
+        <w:tc>
+          <w:tcPr>
+            <w:tcW w:type="dxa" w:w="2160"/>
+          </w:tcPr>
+          <w:p>
+            <w:r/>
+            <w:r>
+              <w:rPr>
+                <w:sz w:val="17"/>
+              </w:rPr>
+              <w:t>Reduced by necessary capex</w:t>
+            </w:r>
+          </w:p>
+        </w:tc>
+        <w:tc>
+          <w:tcPr>
+            <w:tcW w:type="dxa" w:w="2016"/>
+          </w:tcPr>
+          <w:p>
+            <w:r/>
+            <w:r>
+              <w:rPr>
+                <w:sz w:val="17"/>
+              </w:rPr>
+              <w:t>Cash / going-concern situations</w:t>
+            </w:r>
+          </w:p>
+        </w:tc>
+      </w:tr>
+      <w:tr>
+        <w:tc>
+          <w:tcPr>
+            <w:tcW w:type="dxa" w:w="2160"/>
+          </w:tcPr>
+          <w:p>
+            <w:r/>
+            <w:r>
+              <w:rPr>
+                <w:sz w:val="17"/>
+              </w:rPr>
+              <w:t>Reduction in operating cost / loss</w:t>
+            </w:r>
+          </w:p>
+        </w:tc>
+        <w:tc>
+          <w:tcPr>
+            <w:tcW w:type="dxa" w:w="2448"/>
+          </w:tcPr>
+          <w:p>
+            <w:r/>
+            <w:r>
+              <w:rPr>
+                <w:sz w:val="17"/>
+              </w:rPr>
+              <w:t>Cost efficiency and a smaller loss</w:t>
+            </w:r>
+          </w:p>
+        </w:tc>
+        <w:tc>
+          <w:tcPr>
+            <w:tcW w:type="dxa" w:w="2304"/>
+          </w:tcPr>
+          <w:p>
+            <w:r/>
+            <w:r>
+              <w:rPr>
+                <w:sz w:val="17"/>
+              </w:rPr>
+              <w:t>Controllable and achievable now</w:t>
+            </w:r>
+          </w:p>
+        </w:tc>
+        <w:tc>
+          <w:tcPr>
+            <w:tcW w:type="dxa" w:w="2160"/>
+          </w:tcPr>
+          <w:p>
+            <w:r/>
+            <w:r>
+              <w:rPr>
+                <w:sz w:val="17"/>
+              </w:rPr>
+              <w:t>Blunt version rewards mining less</w:t>
+            </w:r>
+          </w:p>
+        </w:tc>
+        <w:tc>
+          <w:tcPr>
+            <w:tcW w:type="dxa" w:w="2016"/>
+          </w:tcPr>
+          <w:p>
+            <w:r/>
+            <w:r>
+              <w:rPr>
+                <w:sz w:val="17"/>
+              </w:rPr>
+              <w:t>A realistic near-term target</w:t>
+            </w:r>
+          </w:p>
+        </w:tc>
+      </w:tr>
+      <w:tr>
+        <w:tc>
+          <w:tcPr>
+            <w:tcW w:type="dxa" w:w="2160"/>
           </w:tcPr>
           <w:p>
             <w:r/>
@@ -1136,7 +1218,7 @@
         </w:tc>
         <w:tc>
           <w:tcPr>
-            <w:tcW w:type="dxa" w:w="2736"/>
+            <w:tcW w:type="dxa" w:w="2448"/>
           </w:tcPr>
           <w:p>
             <w:r/>
@@ -1158,13 +1240,13 @@
               <w:rPr>
                 <w:sz w:val="17"/>
               </w:rPr>
-              <w:t>Simple and avoids the ROI trap</w:t>
+              <w:t>Simple; avoids the ROI trap</w:t>
             </w:r>
           </w:p>
         </w:tc>
         <w:tc>
           <w:tcPr>
-            <w:tcW w:type="dxa" w:w="2304"/>
+            <w:tcW w:type="dxa" w:w="2160"/>
           </w:tcPr>
           <w:p>
             <w:r/>
@@ -1172,7 +1254,7 @@
               <w:rPr>
                 <w:sz w:val="17"/>
               </w:rPr>
-              <w:t>Absolute, so hard to compare sizes</w:t>
+              <w:t>Absolute; needs per-mine data</w:t>
             </w:r>
           </w:p>
         </w:tc>
@@ -1194,7 +1276,7 @@
       <w:tr>
         <w:tc>
           <w:tcPr>
-            <w:tcW w:type="dxa" w:w="1872"/>
+            <w:tcW w:type="dxa" w:w="2160"/>
           </w:tcPr>
           <w:p>
             <w:r/>
@@ -1208,7 +1290,7 @@
         </w:tc>
         <w:tc>
           <w:tcPr>
-            <w:tcW w:type="dxa" w:w="2736"/>
+            <w:tcW w:type="dxa" w:w="2448"/>
           </w:tcPr>
           <w:p>
             <w:r/>
@@ -1236,7 +1318,7 @@
         </w:tc>
         <w:tc>
           <w:tcPr>
-            <w:tcW w:type="dxa" w:w="2304"/>
+            <w:tcW w:type="dxa" w:w="2160"/>
           </w:tcPr>
           <w:p>
             <w:r/>
@@ -1244,7 +1326,7 @@
               <w:rPr>
                 <w:sz w:val="17"/>
               </w:rPr>
-              <w:t>Adjustments are complex and judgemental</w:t>
+              <w:t>Complex; judgemental; data-heavy</w:t>
             </w:r>
           </w:p>
         </w:tc>
@@ -1263,78 +1345,6 @@
           </w:p>
         </w:tc>
       </w:tr>
-      <w:tr>
-        <w:tc>
-          <w:tcPr>
-            <w:tcW w:type="dxa" w:w="1872"/>
-          </w:tcPr>
-          <w:p>
-            <w:r/>
-            <w:r>
-              <w:rPr>
-                <w:sz w:val="17"/>
-              </w:rPr>
-              <w:t>Free cash flow</w:t>
-            </w:r>
-          </w:p>
-        </w:tc>
-        <w:tc>
-          <w:tcPr>
-            <w:tcW w:type="dxa" w:w="2736"/>
-          </w:tcPr>
-          <w:p>
-            <w:r/>
-            <w:r>
-              <w:rPr>
-                <w:sz w:val="17"/>
-              </w:rPr>
-              <w:t>Actual cash generated</w:t>
-            </w:r>
-          </w:p>
-        </w:tc>
-        <w:tc>
-          <w:tcPr>
-            <w:tcW w:type="dxa" w:w="2304"/>
-          </w:tcPr>
-          <w:p>
-            <w:r/>
-            <w:r>
-              <w:rPr>
-                <w:sz w:val="17"/>
-              </w:rPr>
-              <w:t>Hard to manipulate; tracks survival</w:t>
-            </w:r>
-          </w:p>
-        </w:tc>
-        <w:tc>
-          <w:tcPr>
-            <w:tcW w:type="dxa" w:w="2304"/>
-          </w:tcPr>
-          <w:p>
-            <w:r/>
-            <w:r>
-              <w:rPr>
-                <w:sz w:val="17"/>
-              </w:rPr>
-              <w:t>Can be reduced by necessary capex</w:t>
-            </w:r>
-          </w:p>
-        </w:tc>
-        <w:tc>
-          <w:tcPr>
-            <w:tcW w:type="dxa" w:w="2016"/>
-          </w:tcPr>
-          <w:p>
-            <w:r/>
-            <w:r>
-              <w:rPr>
-                <w:sz w:val="17"/>
-              </w:rPr>
-              <w:t>Cash / going-concern situations</w:t>
-            </w:r>
-          </w:p>
-        </w:tc>
-      </w:tr>
     </w:tbl>
     <w:p>
       <w:pPr>
@@ -1349,7 +1359,7 @@
           <w:color w:val="1F3D6B"/>
           <w:sz w:val="26"/>
         </w:rPr>
-        <w:t>6. Applied to Diamante (illustrative, from the pre-release)</w:t>
+        <w:t>7. Applied to Diamante (illustrative, from the pre-release)</w:t>
       </w:r>
     </w:p>
     <w:p>
@@ -1380,7 +1390,7 @@
       <w:tr>
         <w:tc>
           <w:tcPr>
-            <w:tcW w:type="dxa" w:w="2304"/>
+            <w:tcW w:type="dxa" w:w="2448"/>
             <w:shd w:val="clear" w:fill="1f3d6b"/>
           </w:tcPr>
           <w:p>
@@ -1397,7 +1407,7 @@
         </w:tc>
         <w:tc>
           <w:tcPr>
-            <w:tcW w:type="dxa" w:w="4896"/>
+            <w:tcW w:type="dxa" w:w="4608"/>
             <w:shd w:val="clear" w:fill="1f3d6b"/>
           </w:tcPr>
           <w:p>
@@ -1414,7 +1424,7 @@
         </w:tc>
         <w:tc>
           <w:tcPr>
-            <w:tcW w:type="dxa" w:w="1440"/>
+            <w:tcW w:type="dxa" w:w="1584"/>
             <w:shd w:val="clear" w:fill="1f3d6b"/>
           </w:tcPr>
           <w:p>
@@ -1425,7 +1435,7 @@
                 <w:color w:val="FFFFFF"/>
                 <w:sz w:val="17"/>
               </w:rPr>
-              <w:t>Result</w:t>
+              <w:t>Result / proxy</w:t>
             </w:r>
           </w:p>
         </w:tc>
@@ -1450,7 +1460,7 @@
       <w:tr>
         <w:tc>
           <w:tcPr>
-            <w:tcW w:type="dxa" w:w="2304"/>
+            <w:tcW w:type="dxa" w:w="2448"/>
           </w:tcPr>
           <w:p>
             <w:r/>
@@ -1464,7 +1474,7 @@
         </w:tc>
         <w:tc>
           <w:tcPr>
-            <w:tcW w:type="dxa" w:w="4896"/>
+            <w:tcW w:type="dxa" w:w="4608"/>
           </w:tcPr>
           <w:p>
             <w:r/>
@@ -1472,13 +1482,13 @@
               <w:rPr>
                 <w:sz w:val="17"/>
               </w:rPr>
-              <w:t>(979) − (12% × 4 419) = (979) − 530</w:t>
+              <w:t>(979) − (12% × 4 419)</w:t>
             </w:r>
           </w:p>
         </w:tc>
         <w:tc>
           <w:tcPr>
-            <w:tcW w:type="dxa" w:w="1440"/>
+            <w:tcW w:type="dxa" w:w="1584"/>
           </w:tcPr>
           <w:p>
             <w:r/>
@@ -1500,7 +1510,7 @@
               <w:rPr>
                 <w:sz w:val="17"/>
               </w:rPr>
-              <w:t>Deeply negative, so value is being destroyed and no bonus is warranted</w:t>
+              <w:t>Deeply negative — value is being destroyed</w:t>
             </w:r>
           </w:p>
         </w:tc>
@@ -1508,7 +1518,7 @@
       <w:tr>
         <w:tc>
           <w:tcPr>
-            <w:tcW w:type="dxa" w:w="2304"/>
+            <w:tcW w:type="dxa" w:w="2448"/>
           </w:tcPr>
           <w:p>
             <w:r/>
@@ -1522,7 +1532,7 @@
         </w:tc>
         <w:tc>
           <w:tcPr>
-            <w:tcW w:type="dxa" w:w="4896"/>
+            <w:tcW w:type="dxa" w:w="4608"/>
           </w:tcPr>
           <w:p>
             <w:r/>
@@ -1530,13 +1540,13 @@
               <w:rPr>
                 <w:sz w:val="17"/>
               </w:rPr>
-              <w:t>≈ residual income once adjustments and a risk-adjusted WACC are applied</w:t>
+              <w:t>≈ RI after adjustments and a risk-adjusted WACC</w:t>
             </w:r>
           </w:p>
         </w:tc>
         <w:tc>
           <w:tcPr>
-            <w:tcW w:type="dxa" w:w="1440"/>
+            <w:tcW w:type="dxa" w:w="1584"/>
           </w:tcPr>
           <w:p>
             <w:r/>
@@ -1558,7 +1568,7 @@
               <w:rPr>
                 <w:sz w:val="17"/>
               </w:rPr>
-              <w:t>Same conclusion; value destruction</w:t>
+              <w:t>Same conclusion — value destruction</w:t>
             </w:r>
           </w:p>
         </w:tc>
@@ -1566,7 +1576,7 @@
       <w:tr>
         <w:tc>
           <w:tcPr>
-            <w:tcW w:type="dxa" w:w="2304"/>
+            <w:tcW w:type="dxa" w:w="2448"/>
           </w:tcPr>
           <w:p>
             <w:r/>
@@ -1580,7 +1590,7 @@
         </w:tc>
         <w:tc>
           <w:tcPr>
-            <w:tcW w:type="dxa" w:w="4896"/>
+            <w:tcW w:type="dxa" w:w="4608"/>
           </w:tcPr>
           <w:p>
             <w:r/>
@@ -1588,13 +1598,13 @@
               <w:rPr>
                 <w:sz w:val="17"/>
               </w:rPr>
-              <w:t>No cash flow statement is given; adjusted EBITDA of R207m is the best proxy, before capex, interest and tax</w:t>
+              <w:t>No cash flow statement; adjusted EBITDA of R207m is the best proxy</w:t>
             </w:r>
           </w:p>
         </w:tc>
         <w:tc>
           <w:tcPr>
-            <w:tcW w:type="dxa" w:w="1440"/>
+            <w:tcW w:type="dxa" w:w="1584"/>
           </w:tcPr>
           <w:p>
             <w:r/>
@@ -1602,7 +1612,7 @@
               <w:rPr>
                 <w:sz w:val="17"/>
               </w:rPr>
-              <w:t>≈ R207m proxy</w:t>
+              <w:t>≈ R207m</w:t>
             </w:r>
           </w:p>
         </w:tc>
@@ -1616,7 +1626,65 @@
               <w:rPr>
                 <w:sz w:val="17"/>
               </w:rPr>
-              <w:t>Weak positive cash generation, more than halved from R540m</w:t>
+              <w:t>Weak positive cash, more than halved from R540m</w:t>
+            </w:r>
+          </w:p>
+        </w:tc>
+      </w:tr>
+      <w:tr>
+        <w:tc>
+          <w:tcPr>
+            <w:tcW w:type="dxa" w:w="2448"/>
+          </w:tcPr>
+          <w:p>
+            <w:r/>
+            <w:r>
+              <w:rPr>
+                <w:sz w:val="17"/>
+              </w:rPr>
+              <w:t>Reduction in operating cost / loss</w:t>
+            </w:r>
+          </w:p>
+        </w:tc>
+        <w:tc>
+          <w:tcPr>
+            <w:tcW w:type="dxa" w:w="4608"/>
+          </w:tcPr>
+          <w:p>
+            <w:r/>
+            <w:r>
+              <w:rPr>
+                <w:sz w:val="17"/>
+              </w:rPr>
+              <w:t>Operating loss (1 638) vs (864) prior; mining costs 2 295 vs 2 817</w:t>
+            </w:r>
+          </w:p>
+        </w:tc>
+        <w:tc>
+          <w:tcPr>
+            <w:tcW w:type="dxa" w:w="1584"/>
+          </w:tcPr>
+          <w:p>
+            <w:r/>
+            <w:r>
+              <w:rPr>
+                <w:sz w:val="17"/>
+              </w:rPr>
+              <w:t>loss worsened</w:t>
+            </w:r>
+          </w:p>
+        </w:tc>
+        <w:tc>
+          <w:tcPr>
+            <w:tcW w:type="dxa" w:w="2736"/>
+          </w:tcPr>
+          <w:p>
+            <w:r/>
+            <w:r>
+              <w:rPr>
+                <w:sz w:val="17"/>
+              </w:rPr>
+              <w:t>A realistic target would be to reduce the operating loss and cost per carat next year</w:t>
             </w:r>
           </w:p>
         </w:tc>
@@ -1624,14 +1692,285 @@
     </w:tbl>
     <w:p>
       <w:pPr>
-        <w:pStyle w:val="ListBullet"/>
-        <w:spacing w:after="60"/>
+        <w:spacing w:before="200" w:after="40"/>
+        <w:pBdr>
+          <w:bottom w:val="single" w:sz="6" w:space="2" w:color="808080"/>
+        </w:pBdr>
       </w:pPr>
       <w:r>
         <w:rPr>
-          <w:sz w:val="20"/>
+          <w:b/>
+          <w:color w:val="1F3D6B"/>
+          <w:sz w:val="26"/>
         </w:rPr>
-        <w:t>These measures show that Diamante is destroying value on a residual-income and EVA basis, which is exactly why a profit-growth KPI is inappropriate.</w:t>
+        <w:t>8. Ranked recommendation of alternative KPIs for Diamante</w:t>
+      </w:r>
+    </w:p>
+    <w:p>
+      <w:pPr>
+        <w:spacing w:after="80"/>
+      </w:pPr>
+      <w:r>
+        <w:rPr>
+          <w:i/>
+          <w:sz w:val="18"/>
+        </w:rPr>
+        <w:t>Ranked by how suitable each is for Diamante now, judged on relevance to survival, controllability, achievability, resistance to manipulation, and the data available.</w:t>
+      </w:r>
+    </w:p>
+    <w:tbl>
+      <w:tblPr>
+        <w:tblStyle w:val="TableGrid"/>
+        <w:tblW w:type="auto" w:w="0"/>
+        <w:jc w:val="center"/>
+        <w:tblLook w:firstColumn="1" w:firstRow="1" w:lastColumn="0" w:lastRow="0" w:noHBand="0" w:noVBand="1" w:val="04A0"/>
+      </w:tblPr>
+      <w:tblGrid>
+        <w:gridCol w:w="3504"/>
+        <w:gridCol w:w="3504"/>
+        <w:gridCol w:w="3504"/>
+      </w:tblGrid>
+      <w:tr>
+        <w:tc>
+          <w:tcPr>
+            <w:tcW w:type="dxa" w:w="720"/>
+            <w:shd w:val="clear" w:fill="1f3d6b"/>
+          </w:tcPr>
+          <w:p>
+            <w:r/>
+            <w:r>
+              <w:rPr>
+                <w:b/>
+                <w:color w:val="FFFFFF"/>
+                <w:sz w:val="17"/>
+              </w:rPr>
+              <w:t>Rank</w:t>
+            </w:r>
+          </w:p>
+        </w:tc>
+        <w:tc>
+          <w:tcPr>
+            <w:tcW w:type="dxa" w:w="3168"/>
+            <w:shd w:val="clear" w:fill="1f3d6b"/>
+          </w:tcPr>
+          <w:p>
+            <w:r/>
+            <w:r>
+              <w:rPr>
+                <w:b/>
+                <w:color w:val="FFFFFF"/>
+                <w:sz w:val="17"/>
+              </w:rPr>
+              <w:t>Measure</w:t>
+            </w:r>
+          </w:p>
+        </w:tc>
+        <w:tc>
+          <w:tcPr>
+            <w:tcW w:type="dxa" w:w="6480"/>
+            <w:shd w:val="clear" w:fill="1f3d6b"/>
+          </w:tcPr>
+          <w:p>
+            <w:r/>
+            <w:r>
+              <w:rPr>
+                <w:b/>
+                <w:color w:val="FFFFFF"/>
+                <w:sz w:val="17"/>
+              </w:rPr>
+              <w:t>Why it is chosen and placed here for Diamante</w:t>
+            </w:r>
+          </w:p>
+        </w:tc>
+      </w:tr>
+      <w:tr>
+        <w:tc>
+          <w:tcPr>
+            <w:tcW w:type="dxa" w:w="720"/>
+          </w:tcPr>
+          <w:p>
+            <w:r/>
+            <w:r>
+              <w:rPr>
+                <w:sz w:val="17"/>
+              </w:rPr>
+              <w:t>1</w:t>
+            </w:r>
+          </w:p>
+        </w:tc>
+        <w:tc>
+          <w:tcPr>
+            <w:tcW w:type="dxa" w:w="3168"/>
+          </w:tcPr>
+          <w:p>
+            <w:r/>
+            <w:r>
+              <w:rPr>
+                <w:sz w:val="17"/>
+              </w:rPr>
+              <w:t>Free cash flow</w:t>
+            </w:r>
+          </w:p>
+        </w:tc>
+        <w:tc>
+          <w:tcPr>
+            <w:tcW w:type="dxa" w:w="6480"/>
+          </w:tcPr>
+          <w:p>
+            <w:r/>
+            <w:r>
+              <w:rPr>
+                <w:sz w:val="17"/>
+              </w:rPr>
+              <w:t>Diamante’s number one priority is survival and completing the refinancing, and free cash flow rewards exactly the cash that pays down debt. It is highly controllable, very hard to manipulate, and can be gated to the refinancing, so it is the single best fit right now.</w:t>
+            </w:r>
+          </w:p>
+        </w:tc>
+      </w:tr>
+      <w:tr>
+        <w:tc>
+          <w:tcPr>
+            <w:tcW w:type="dxa" w:w="720"/>
+          </w:tcPr>
+          <w:p>
+            <w:r/>
+            <w:r>
+              <w:rPr>
+                <w:sz w:val="17"/>
+              </w:rPr>
+              <w:t>2</w:t>
+            </w:r>
+          </w:p>
+        </w:tc>
+        <w:tc>
+          <w:tcPr>
+            <w:tcW w:type="dxa" w:w="3168"/>
+          </w:tcPr>
+          <w:p>
+            <w:r/>
+            <w:r>
+              <w:rPr>
+                <w:sz w:val="17"/>
+              </w:rPr>
+              <w:t>Reduction in operating cost / operating loss (as cost per carat)</w:t>
+            </w:r>
+          </w:p>
+        </w:tc>
+        <w:tc>
+          <w:tcPr>
+            <w:tcW w:type="dxa" w:w="6480"/>
+          </w:tcPr>
+          <w:p>
+            <w:r/>
+            <w:r>
+              <w:rPr>
+                <w:sz w:val="17"/>
+              </w:rPr>
+              <w:t>It is controllable and, unlike the impossible profit-growth target, it is achievable and motivating for a loss-making company. It directly addresses the fact that mining costs exceed revenue, provided it is measured as cost per carat with a safety and volume guardrail so managers cannot win by mining less.</w:t>
+            </w:r>
+          </w:p>
+        </w:tc>
+      </w:tr>
+      <w:tr>
+        <w:tc>
+          <w:tcPr>
+            <w:tcW w:type="dxa" w:w="720"/>
+          </w:tcPr>
+          <w:p>
+            <w:r/>
+            <w:r>
+              <w:rPr>
+                <w:sz w:val="17"/>
+              </w:rPr>
+              <w:t>3</w:t>
+            </w:r>
+          </w:p>
+        </w:tc>
+        <w:tc>
+          <w:tcPr>
+            <w:tcW w:type="dxa" w:w="3168"/>
+          </w:tcPr>
+          <w:p>
+            <w:r/>
+            <w:r>
+              <w:rPr>
+                <w:sz w:val="17"/>
+              </w:rPr>
+              <w:t>Residual income</w:t>
+            </w:r>
+          </w:p>
+        </w:tc>
+        <w:tc>
+          <w:tcPr>
+            <w:tcW w:type="dxa" w:w="6480"/>
+          </w:tcPr>
+          <w:p>
+            <w:r/>
+            <w:r>
+              <w:rPr>
+                <w:sz w:val="17"/>
+              </w:rPr>
+              <w:t>It is the best simple measure of real value creation above the cost of capital and corrects the flaws of profit and ROI. It ranks below the first two because it is deeply negative now (which can demotivate) and it needs per-mine asset data that Diamante does not yet disclose.</w:t>
+            </w:r>
+          </w:p>
+        </w:tc>
+      </w:tr>
+      <w:tr>
+        <w:tc>
+          <w:tcPr>
+            <w:tcW w:type="dxa" w:w="720"/>
+          </w:tcPr>
+          <w:p>
+            <w:r/>
+            <w:r>
+              <w:rPr>
+                <w:sz w:val="17"/>
+              </w:rPr>
+              <w:t>4</w:t>
+            </w:r>
+          </w:p>
+        </w:tc>
+        <w:tc>
+          <w:tcPr>
+            <w:tcW w:type="dxa" w:w="3168"/>
+          </w:tcPr>
+          <w:p>
+            <w:r/>
+            <w:r>
+              <w:rPr>
+                <w:sz w:val="17"/>
+              </w:rPr>
+              <w:t>Economic value added</w:t>
+            </w:r>
+          </w:p>
+        </w:tc>
+        <w:tc>
+          <w:tcPr>
+            <w:tcW w:type="dxa" w:w="6480"/>
+          </w:tcPr>
+          <w:p>
+            <w:r/>
+            <w:r>
+              <w:rPr>
+                <w:sz w:val="17"/>
+              </w:rPr>
+              <w:t>It is the theoretically strongest measure of shareholder value and best discourages short-term decisions. It ranks last for now only because it is the most complex and data-heavy, relies on judgemental adjustments and a risk-adjusted WACC, and is deeply negative in the current downturn, so it is best reserved as a longer-term executive measure once recovery is underway.</w:t>
+            </w:r>
+          </w:p>
+        </w:tc>
+      </w:tr>
+    </w:tbl>
+    <w:p>
+      <w:pPr>
+        <w:spacing w:before="100" w:after="20"/>
+      </w:pPr>
+      <w:r>
+        <w:rPr>
+          <w:b/>
+          <w:color w:val="1F3D6B"/>
+          <w:sz w:val="22"/>
+        </w:rPr>
+        <w:t>Substantiation summary</w:t>
       </w:r>
     </w:p>
     <w:p>
@@ -1643,7 +1982,7 @@
         <w:rPr>
           <w:sz w:val="20"/>
         </w:rPr>
-        <w:t>They support rebuilding the incentive scheme around residual income or EVA for value, and free cash flow for survival.</w:t>
+        <w:t>Free cash flow is first, because cash and the refinancing are what keep Diamante alive, and it cannot easily be gamed.</w:t>
       </w:r>
     </w:p>
     <w:p>
@@ -1655,7 +1994,43 @@
         <w:rPr>
           <w:sz w:val="20"/>
         </w:rPr>
-        <w:t>A per-mine residual income would need each mine’s own assets and profit, which are not disclosed and should be requested.</w:t>
+        <w:t>Reduction in operating cost or loss is second, because it is the most achievable and controllable near-term target for a loss-making company, and it attacks the core cost problem directly.</w:t>
+      </w:r>
+    </w:p>
+    <w:p>
+      <w:pPr>
+        <w:pStyle w:val="ListBullet"/>
+        <w:spacing w:after="60"/>
+      </w:pPr>
+      <w:r>
+        <w:rPr>
+          <w:sz w:val="20"/>
+        </w:rPr>
+        <w:t>Residual income is third, because it rewards genuine value creation but is negative now and needs divisional data that is missing.</w:t>
+      </w:r>
+    </w:p>
+    <w:p>
+      <w:pPr>
+        <w:pStyle w:val="ListBullet"/>
+        <w:spacing w:after="60"/>
+      </w:pPr>
+      <w:r>
+        <w:rPr>
+          <w:sz w:val="20"/>
+        </w:rPr>
+        <w:t>Economic value added is fourth, because it is the strongest measure in theory but the hardest to apply during a crisis, so it fits better as a recovery-phase executive measure.</w:t>
+      </w:r>
+    </w:p>
+    <w:p>
+      <w:pPr>
+        <w:pStyle w:val="ListBullet"/>
+        <w:spacing w:after="60"/>
+      </w:pPr>
+      <w:r>
+        <w:rPr>
+          <w:sz w:val="20"/>
+        </w:rPr>
+        <w:t>In practice Diamante should use a combination rather than one measure, with free cash flow and cost per carat rewarded first, residual income added as data improves, and EVA introduced as the long-term executive layer.</w:t>
       </w:r>
     </w:p>
     <w:p>
@@ -1671,7 +2046,7 @@
           <w:color w:val="1F3D6B"/>
           <w:sz w:val="26"/>
         </w:rPr>
-        <w:t>7. Key points for using these in an incentive scheme</w:t>
+        <w:t>9. Key points for using these in an incentive scheme</w:t>
       </w:r>
     </w:p>
     <w:p>
@@ -1695,18 +2070,6 @@
         <w:rPr>
           <w:sz w:val="20"/>
         </w:rPr>
-        <w:t>Use residual income or EVA to reward value creation, and free cash flow to reward the cash that funds survival.</w:t>
-      </w:r>
-    </w:p>
-    <w:p>
-      <w:pPr>
-        <w:pStyle w:val="ListBullet"/>
-        <w:spacing w:after="60"/>
-      </w:pPr>
-      <w:r>
-        <w:rPr>
-          <w:sz w:val="20"/>
-        </w:rPr>
         <w:t>Attach a bonus bank, so part of the reward is held back and forfeited when value is destroyed.</w:t>
       </w:r>
     </w:p>
@@ -1719,7 +2082,7 @@
         <w:rPr>
           <w:sz w:val="20"/>
         </w:rPr>
-        <w:t>Tier the measures, with executives on group EVA and free cash flow and mine managers on their own residual income and cash.</w:t>
+        <w:t>Tier the measures, with executives on group free cash flow and EVA and mine managers on their own cost per carat and residual income.</w:t>
       </w:r>
     </w:p>
     <w:p>
@@ -1743,7 +2106,7 @@
           <w:i/>
           <w:sz w:val="17"/>
         </w:rPr>
-        <w:t>Based on the IAC 2026 MAF performance-evaluation notes (residual income, EVA, net investment and NOPAT conventions) and the free cash flow method; the tax factor reflects the 27% rate. Diamante figures are illustrative from the draft pre-release.</w:t>
+        <w:t>Based on the IAC 2026 MAF performance-evaluation notes and the free cash flow method; the tax factor reflects the 27% rate. Diamante figures are illustrative from the draft pre-release.</w:t>
       </w:r>
     </w:p>
     <w:sectPr>

</xml_diff>